<commit_message>
Fix header/Word-2007 templates, rename to Head Draughtsman, tighten circle guard
Templates:
- Work order: merge the split "O"+"ffice of the" runs into one bold-italic
  run so the header no longer renders a small upright "O"; bump the office
  address block from 11pt to 14pt for balance against the title.
- Forwarding slip: make it open in Word 2007 — replace mc:AlternateContent
  with its VML Fallback (a plain horizontal rule) and convert strict-schema
  w:start/w:end to w:left/w:right in both document.xml and styles.xml.

Rename user-visible "Head Draftsman" to "Head Draughtsman" everywhere
(UI labels, window title, product name, README, comments). Technical
identifiers (npm name, appId, GitHub repo, Firebase project) are unchanged.

WorkOrderAgreementTab: fall back to directory-inferred circle and compare
against the office-or-row target circle so an L-1 from another circle can't
issue documents under the wrong circle.

Co-Authored-By: Claude Opus 4.8 <noreply@anthropic.com>
</commit_message>
<xml_diff>
--- a/resources/forwarding-slip-template.docx
+++ b/resources/forwarding-slip-template.docx
@@ -5,7 +5,7 @@
     <w:p>
       <w:pPr>
         <w:pStyle w:val="Normal"/>
-        <w:ind w:firstLine="720" w:start="1440" w:end="0"/>
+        <w:ind w:firstLine="720" w:left="1440" w:right="0"/>
         <w:rPr>
           <w:b/>
           <w:sz w:val="22"/>
@@ -24,7 +24,7 @@
     <w:p>
       <w:pPr>
         <w:pStyle w:val="Normal"/>
-        <w:ind w:firstLine="720" w:end="0"/>
+        <w:ind w:firstLine="720" w:right="0"/>
         <w:jc w:val="center"/>
         <w:rPr>
           <w:b/>
@@ -57,63 +57,13 @@
           <w:szCs w:val="22"/>
           <w:lang w:val="en-IN" w:eastAsia="en-IN"/>
         </w:rPr>
-        <mc:AlternateContent>
-          <mc:Choice Requires="wps">
-            <w:drawing>
-              <wp:anchor distT="0" distB="0" distL="114935" distR="114935" simplePos="0" relativeHeight="24" behindDoc="0" locked="0" layoutInCell="1" allowOverlap="1">
-                <wp:simplePos x="0" y="0"/>
-                <wp:positionH relativeFrom="column">
-                  <wp:posOffset>-228600</wp:posOffset>
-                </wp:positionH>
-                <wp:positionV relativeFrom="paragraph">
-                  <wp:posOffset>635</wp:posOffset>
-                </wp:positionV>
-                <wp:extent cx="6515100" cy="0"/>
-                <wp:effectExtent l="0" t="9525" r="0" b="9525"/>
-                <wp:wrapNone/>
-                <wp:docPr id="1" name=""/>
-                <a:graphic xmlns:a="http://schemas.openxmlformats.org/drawingml/2006/main">
-                  <a:graphicData uri="http://schemas.microsoft.com/office/word/2010/wordprocessingShape">
-                    <wps:wsp>
-                      <wps:cNvSpPr/>
-                      <wps:spPr>
-                        <a:xfrm>
-                          <a:off x="0" y="0"/>
-                          <a:ext cx="6515280" cy="0"/>
-                        </a:xfrm>
-                        <a:prstGeom prst="line">
-                          <a:avLst/>
-                        </a:prstGeom>
-                        <a:ln w="19080">
-                          <a:solidFill>
-                            <a:srgbClr val="000000"/>
-                          </a:solidFill>
-                          <a:miter/>
-                        </a:ln>
-                      </wps:spPr>
-                      <wps:style>
-                        <a:lnRef idx="0"/>
-                        <a:fillRef idx="0"/>
-                        <a:effectRef idx="0"/>
-                        <a:fontRef idx="minor"/>
-                      </wps:style>
-                      <wps:bodyPr/>
-                    </wps:wsp>
-                  </a:graphicData>
-                </a:graphic>
-              </wp:anchor>
-            </w:drawing>
-          </mc:Choice>
-          <mc:Fallback>
-            <w:pict>
-              <v:line id="shape_0" from="-18pt,0pt" to="494.95pt,0pt" stroked="t" o:allowincell="f" style="position:absolute">
-                <v:stroke color="black" weight="19080" joinstyle="miter" endcap="flat"/>
-                <v:fill o:detectmouseclick="t" on="false"/>
-                <w10:wrap type="none"/>
-              </v:line>
-            </w:pict>
-          </mc:Fallback>
-        </mc:AlternateContent>
+        <w:pict>
+          <v:line id="shape_0" from="-18pt,0pt" to="494.95pt,0pt" stroked="t" o:allowincell="f" style="position:absolute">
+            <v:stroke color="black" weight="19080" joinstyle="miter" endcap="flat"/>
+            <v:fill o:detectmouseclick="t" on="false"/>
+            <w10:wrap type="none"/>
+          </v:line>
+        </w:pict>
       </w:r>
     </w:p>
     <w:p>
@@ -179,9 +129,9 @@
         <w:tblLayout w:type="fixed"/>
         <w:tblCellMar>
           <w:top w:w="0" w:type="dxa"/>
-          <w:start w:w="108" w:type="dxa"/>
+          <w:left w:w="108" w:type="dxa"/>
           <w:bottom w:w="0" w:type="dxa"/>
-          <w:end w:w="108" w:type="dxa"/>
+          <w:right w:w="108" w:type="dxa"/>
         </w:tblCellMar>
       </w:tblPr>
       <w:tblGrid>
@@ -2684,7 +2634,7 @@
     <w:name w:val="Body Text Indent"/>
     <w:basedOn w:val="Normal"/>
     <w:pPr>
-      <w:ind w:hanging="0" w:start="360" w:end="0"/>
+      <w:ind w:hanging="0" w:left="360" w:right="0"/>
     </w:pPr>
     <w:rPr>
       <w:rFonts w:ascii="Bookman Old Style" w:hAnsi="Bookman Old Style" w:cs="Gautami"/>

</xml_diff>

<commit_message>
Release 1.18.0 — SE office document expansion, Intimation page redesign, photo crop tool
- Give Intimation (SE/Zone offices): TS Note, Eligibility Criteria, Bid
  Evaluation Note, Agency Approval Note, with Cement & Steel rate OCR upload
- Agreement/Work Order (SE/Zone offices): Agreement Bond, Agreement Put-up
  Note, Contract Deed, SE Schedule A, Balance EMD receipt upload
- Schedule A now shows automatically alongside other documents
- Give Intimation page redesigned to match the Agreement page's tile-grid
  + preview-modal layout, with a "Download all documents" button
- Photos to PDF: crop/rotate/filter step before conversion
- Fixes: SE Agreement Bond date, several documents' signature-block
  alignment, EE-only Balance EMD button, backdrop-click-to-close on
  modals misfiring during text selection

Co-Authored-By: Claude Sonnet 5 <noreply@anthropic.com>
</commit_message>
<xml_diff>
--- a/resources/forwarding-slip-template.docx
+++ b/resources/forwarding-slip-template.docx
@@ -2348,6 +2348,7 @@
     <w:p>
       <w:pPr>
         <w:pStyle w:val="Normal"/>
+        <w:jc w:val="right"/>
         <w:rPr>
           <w:b/>
           <w:sz w:val="22"/>
@@ -2360,20 +2361,15 @@
           <w:sz w:val="22"/>
           <w:szCs w:val="22"/>
         </w:rPr>
-        <w:t xml:space="preserve">                                                                                                                    </w:t>
-      </w:r>
-      <w:r>
-        <w:rPr>
-          <w:b/>
-          <w:sz w:val="22"/>
-          <w:szCs w:val="22"/>
-        </w:rPr>
         <w:t>Executive Engineer</w:t>
       </w:r>
     </w:p>
     <w:p>
       <w:pPr>
         <w:pStyle w:val="Normal"/>
+        <w:tabs>
+          <w:tab w:val="right" w:pos="9026"/>
+        </w:tabs>
         <w:rPr>
           <w:b/>
           <w:sz w:val="22"/>
@@ -2388,13 +2384,7 @@
         </w:rPr>
         <w:t>Tenderer</w:t>
         <w:tab/>
-        <w:tab/>
-        <w:tab/>
-        <w:tab/>
-        <w:tab/>
-        <w:tab/>
-        <w:tab/>
-        <w:t xml:space="preserve">   {{Circle}} Circle-{{CNO}},{{Corporation}}. </w:t>
+        <w:t>{{Circle}} Circle-{{CNO}},{{Corporation}}.</w:t>
       </w:r>
     </w:p>
     <w:sectPr>

</xml_diff>

<commit_message>
Release 1.19.0 — SE Bid Document, SE preview layout fixes, sidebar polish
- New SE (Zone office) Bid Document: dedicated template + fill logic,
  automatically replacing the EE/Circle format for a Zone office; new
  "Issue Bid Document" tile below the Calendar generates one directly
  from a Works List entry without needing a tender notice first.
- Give Intimation (SE/Zone offices): document preview modals now show
  their manual fields beside the preview instead of stacked above it.
- Every page's title/action bar now stays fixed while its content
  scrolls, instead of the whole page scrolling as one.
- Fixed: Forwarding Slip's Technical Sanction No & Date field printed
  in tiny, misplaced text (broken font size baked into the template).
- Sidebar: background art + a button to reopen the What's New log.
- Skyline background swapped to real Charminar/Thousand Pillar Temple
  line art; Evaluation Sheet upload button fixed.

Co-Authored-By: Claude Sonnet 5 <noreply@anthropic.com>
</commit_message>
<xml_diff>
--- a/resources/forwarding-slip-template.docx
+++ b/resources/forwarding-slip-template.docx
@@ -426,14 +426,14 @@
               <w:pStyle w:val="Normal"/>
               <w:snapToGrid w:val="false"/>
               <w:rPr>
-                <w:sz w:val="10"/>
-                <w:szCs w:val="8"/>
-              </w:rPr>
-            </w:pPr>
-            <w:r>
-              <w:rPr>
-                <w:sz w:val="10"/>
-                <w:szCs w:val="8"/>
+                <w:sz w:val="22"/>
+                <w:szCs w:val="22"/>
+              </w:rPr>
+            </w:pPr>
+            <w:r>
+              <w:rPr>
+                <w:sz w:val="22"/>
+                <w:szCs w:val="22"/>
               </w:rPr>
               <w:t>{{Technical Sanction No and Date}}</w:t>
             </w:r>

</xml_diff>